<commit_message>
Portfolio graphisme + intégration des réalisations au CV
Réalisations retrouvées sur la branche main du dépôt (34 visuels) :
- logo du Benin Science Leadership Program (B-SLP)
- série d'attestations du projet MINNAGAN (UE / Erasmus+)
- étiquette produit PolFFree-AC (URMAPHA)
- mise en page de documents scientifiques
- série de visuels réseaux sociaux

- Portfolio PDF de 7 pages (reportlab), noms de tiers masqués sur les
  attestations nominatives
- Script de régénération outils/construire_portfolio.py
- Rubrique « Réalisations en graphisme » ajoutée aux deux CV
- Lettre PAM : citation nominative du logo B-SLP et de MINNAGAN
- Titre réglé : licence nationale (cursus ingénieur des travaux)
- Permis B, notions de fon et de mina ajoutés
- Tableau de bord : section sur ce que ces réalisations changent

Co-authored-by: arena-agent <297053741+arena-agent@users.noreply.github.com>
</commit_message>
<xml_diff>
--- a/candidatures/02_Dossiers/01_PAM_Communication_Assistant_Cotonou/CV_GNACADJA_Marie_Edith_Communication_Assistant_PAM.docx
+++ b/candidatures/02_Dossiers/01_PAM_Communication_Assistant_Cotonou/CV_GNACADJA_Marie_Edith_Communication_Assistant_PAM.docx
@@ -49,7 +49,7 @@
           <w:b w:val="0"/>
           <w:i w:val="0"/>
         </w:rPr>
-        <w:t>Nationalité béninoise · Français courant · Anglais intermédiaire (compréhension de documents scientifiques, expression écrite et orale) · Disponibilité immédiate</w:t>
+        <w:t>Nationalité béninoise · Permis B · Français courant, notions de fon et de mina · Anglais intermédiaire · Disponibilité immédiate</w:t>
       </w:r>
     </w:p>
     <w:p>
@@ -85,7 +85,7 @@
           <w:b w:val="0"/>
           <w:i w:val="0"/>
         </w:rPr>
-        <w:t>Nutritionniste de santé publique, titulaire d'un Master en Nutrition et santé des populations (IRSP Ouidah, 2025-2026) et formée au graphisme. Trois analyses de situation menées en zones sanitaires — départementale, nutritionnelle et étude interventionnelle communautaire — m'ont donné l'habitude de transformer des données de terrain en messages clairs : rapports, présentations, supports de sensibilisation.</w:t>
+        <w:t>Nutritionniste de santé publique, titulaire d'un Master en Nutrition et santé des populations (IRSP Ouidah, 2025-2026) et graphiste — auteure du logo du Benin Science Leadership Program (B-SLP) et de la série d'attestations du programme MINNAGAN financé par l'Union européenne. Trois analyses de situation menées en zones sanitaires — départementale, nutritionnelle et étude interventionnelle communautaire — m'ont donné l'habitude de transformer des données de terrain en messages clairs : rapports, présentations, supports de sensibilisation.</w:t>
       </w:r>
     </w:p>
     <w:p>
@@ -662,6 +662,150 @@
           <w:color w:val="1F3B57"/>
           <w:sz w:val="21"/>
         </w:rPr>
+        <w:t>RÉALISATIONS EN GRAPHISME ET COMMUNICATION VISUELLE</w:t>
+      </w:r>
+    </w:p>
+    <w:p>
+      <w:pPr>
+        <w:jc w:val="left"/>
+      </w:pPr>
+      <w:r>
+        <w:rPr>
+          <w:b/>
+          <w:i w:val="0"/>
+        </w:rPr>
+        <w:t>Identité visuelle — Benin Science Leadership Program (B-SLP)</w:t>
+      </w:r>
+    </w:p>
+    <w:p>
+      <w:pPr>
+        <w:jc w:val="left"/>
+      </w:pPr>
+      <w:r>
+        <w:rPr>
+          <w:b w:val="0"/>
+          <w:i w:val="0"/>
+        </w:rPr>
+        <w:t>Conception du logo du programme de leadership scientifique au Bénin. La silhouette du pays est construite en pointillés à partir de structures moléculaires, associée à une cible symbolisant l'objectif et la trajectoire.</w:t>
+      </w:r>
+    </w:p>
+    <w:p>
+      <w:pPr>
+        <w:jc w:val="left"/>
+      </w:pPr>
+      <w:r>
+        <w:rPr>
+          <w:b/>
+          <w:i w:val="0"/>
+        </w:rPr>
+        <w:t>Série d'attestations — programme MINNAGAN (Union européenne, Erasmus+)</w:t>
+      </w:r>
+    </w:p>
+    <w:p>
+      <w:pPr>
+        <w:jc w:val="left"/>
+      </w:pPr>
+      <w:r>
+        <w:rPr>
+          <w:b w:val="0"/>
+          <w:i w:val="0"/>
+        </w:rPr>
+        <w:t>Conception et mise en page d'une famille d'attestations (participation, supervision d'enquête, formation pédagogique, formation de formateurs) pour un programme réunissant l'Université d'Abomey-Calavi, l'UNSTIM, l'Université de Parakou, l'Université de Helsinki, l'Université San Jorge et le ministère de la Santé. Système graphique décliné avec intégration des logos partenaires.</w:t>
+      </w:r>
+    </w:p>
+    <w:p>
+      <w:pPr>
+        <w:jc w:val="left"/>
+      </w:pPr>
+      <w:r>
+        <w:rPr>
+          <w:b/>
+          <w:i w:val="0"/>
+        </w:rPr>
+        <w:t>Étiquette produit — charbon actif PolFFree-AC (URMAPHA)</w:t>
+      </w:r>
+    </w:p>
+    <w:p>
+      <w:pPr>
+        <w:jc w:val="left"/>
+      </w:pPr>
+      <w:r>
+        <w:rPr>
+          <w:b w:val="0"/>
+          <w:i w:val="0"/>
+        </w:rPr>
+        <w:t>Création du visuel de présentation d'un charbon actif destiné à éliminer les polluants organiques de l'eau : matière première, produit fini, indication d'usage et identification du laboratoire.</w:t>
+      </w:r>
+    </w:p>
+    <w:p>
+      <w:pPr>
+        <w:jc w:val="left"/>
+      </w:pPr>
+      <w:r>
+        <w:rPr>
+          <w:b/>
+          <w:i w:val="0"/>
+        </w:rPr>
+        <w:t>Mise en page de documents scientifiques</w:t>
+      </w:r>
+    </w:p>
+    <w:p>
+      <w:pPr>
+        <w:jc w:val="left"/>
+      </w:pPr>
+      <w:r>
+        <w:rPr>
+          <w:b w:val="0"/>
+          <w:i w:val="0"/>
+        </w:rPr>
+        <w:t>Mise en forme de tableaux de synthèse et de supports de formation pour l'URMAPHA et l'École polytechnique d'Abomey-Calavi.</w:t>
+      </w:r>
+    </w:p>
+    <w:p>
+      <w:pPr>
+        <w:jc w:val="left"/>
+      </w:pPr>
+      <w:r>
+        <w:rPr>
+          <w:b/>
+          <w:i w:val="0"/>
+        </w:rPr>
+        <w:t>Série de visuels pour réseaux sociaux</w:t>
+      </w:r>
+    </w:p>
+    <w:p>
+      <w:pPr>
+        <w:jc w:val="left"/>
+      </w:pPr>
+      <w:r>
+        <w:rPr>
+          <w:b w:val="0"/>
+          <w:i w:val="0"/>
+        </w:rPr>
+        <w:t>Conception d'une série de visuels au format carré, avec palette, typographie et gabarits réutilisables.</w:t>
+      </w:r>
+    </w:p>
+    <w:p>
+      <w:pPr>
+        <w:pBdr>
+          <w:bottom w:val="single" w:sz="4" w:space="2" w:color="BBBBBB"/>
+        </w:pBdr>
+        <w:spacing w:before="40" w:after="80"/>
+      </w:pPr>
+    </w:p>
+    <w:p>
+      <w:pPr>
+        <w:spacing w:before="180" w:after="60"/>
+        <w:pBdr>
+          <w:bottom w:val="single" w:sz="6" w:space="2" w:color="1F3B57"/>
+        </w:pBdr>
+      </w:pPr>
+      <w:r>
+        <w:rPr>
+          <w:b/>
+          <w:color w:val="1F3B57"/>
+          <w:sz w:val="21"/>
+        </w:rPr>
         <w:t>FORMATION</w:t>
       </w:r>
     </w:p>
@@ -890,7 +1034,7 @@
                 <w:i w:val="0"/>
                 <w:sz w:val="17"/>
               </w:rPr>
-              <w:t>Licence en Biologie Médicale</w:t>
+              <w:t>Licence en Biologie Médicale — diplôme national</w:t>
             </w:r>
           </w:p>
         </w:tc>
@@ -1220,7 +1364,31 @@
           <w:b w:val="0"/>
           <w:i w:val="0"/>
         </w:rPr>
-        <w:t>Français — courant (oral et écrit) · Anglais — intermédiaire (lecture de documents scientifiques, expression écrite et orale)</w:t>
+        <w:t>Français — courant (oral et écrit) · Anglais — intermédiaire (lecture de documents scientifiques, expression écrite et orale) · Fon et mina — notions</w:t>
+      </w:r>
+    </w:p>
+    <w:p>
+      <w:pPr>
+        <w:jc w:val="left"/>
+      </w:pPr>
+      <w:r>
+        <w:rPr>
+          <w:b/>
+          <w:i w:val="0"/>
+        </w:rPr>
+        <w:t>Autres</w:t>
+      </w:r>
+    </w:p>
+    <w:p>
+      <w:pPr>
+        <w:jc w:val="left"/>
+      </w:pPr>
+      <w:r>
+        <w:rPr>
+          <w:b w:val="0"/>
+          <w:i w:val="0"/>
+        </w:rPr>
+        <w:t>Permis B</w:t>
       </w:r>
     </w:p>
     <w:p>

</xml_diff>